<commit_message>
Reorganize docs into Word/Powerpoint subfolders and anonymize Bechtle template
- Move all .docx files to docs/kickoff/Word/ and docs/konzept/Word/
- Move .pptx to docs/kickoff/Powerpoint/
- Update all generator script output paths to match new folder structure
- Anonymize VORLAGE_Bechtle_Management_Summary.docx: replace MDF AG / Office LTSC
  customer references with generic <KUNDE>, <PROJEKTTITEL>, <RANDTHEMA> placeholders

https://claude.ai/code/session_01DSkzcxBS9BsVaThtWgrZPV
</commit_message>
<xml_diff>
--- a/docs/konzept/bechtle-brand/VORLAGE_Bechtle_Management_Summary.docx
+++ b/docs/konzept/bechtle-brand/VORLAGE_Bechtle_Management_Summary.docx
@@ -34,7 +34,7 @@
         <w:rPr>
           <w:sz w:val="26"/>
         </w:rPr>
-        <w:t>Office LTSC zu Microsoft 365 Apps: Zielbild, Pilotierung, Roadmap und Sonderfälle</w:t>
+        <w:t>&lt;PROJEKTTITEL&gt;: Zielbild, Pilotierung, Roadmap und Sonderfälle</w:t>
       </w:r>
     </w:p>
     <w:p/>
@@ -104,7 +104,7 @@
           </w:tcPr>
           <w:p>
             <w:r>
-              <w:t>Mitteldeutsche Flughafen AG / MDF AG</w:t>
+              <w:t>&lt;KUNDENNAME&gt;</w:t>
             </w:r>
           </w:p>
         </w:tc>
@@ -129,7 +129,7 @@
           </w:tcPr>
           <w:p>
             <w:r>
-              <w:t>Office LTSC zu Microsoft 365 Apps</w:t>
+              <w:t>&lt;PROJEKTTITEL&gt;</w:t>
             </w:r>
           </w:p>
         </w:tc>
@@ -154,7 +154,7 @@
           </w:tcPr>
           <w:p>
             <w:r>
-              <w:t>Zentrale Workshop-Unterlage / Version Randthemen</w:t>
+              <w:t>&lt;DOKUMENTTYP&gt;</w:t>
             </w:r>
           </w:p>
         </w:tc>
@@ -179,7 +179,7 @@
           </w:tcPr>
           <w:p>
             <w:r>
-              <w:t>1.0 - Kundenabgabe</w:t>
+              <w:t>1.0</w:t>
             </w:r>
           </w:p>
         </w:tc>
@@ -204,14 +204,10 @@
           </w:tcPr>
           <w:p>
             <w:r>
-              <w:t>2</w:t>
-            </w:r>
-            <w:r>
-              <w:t>6</w:t>
-            </w:r>
-            <w:r>
-              <w:t>.05.2026</w:t>
-            </w:r>
+              <w:t>&lt;DATUM&gt;</w:t>
+            </w:r>
+            <w:r/>
+            <w:r/>
           </w:p>
         </w:tc>
       </w:tr>
@@ -1229,7 +1225,7 @@
           </w:tcPr>
           <w:p>
             <w:r>
-              <w:t>Office LTSC zu Microsoft 365 Apps, Updatekanäle, Kompatibilität, Fachbereiche, Makros/Add-ins/Plugins, Pilotierung und Roadmap.</w:t>
+              <w:t>&lt;PROJEKTTITEL&gt;, Updatekanäle, Kompatibilität, Fachbereiche, Makros/Add-ins/Plugins, Pilotierung und Roadmap.</w:t>
             </w:r>
           </w:p>
         </w:tc>
@@ -1254,7 +1250,7 @@
           </w:tcPr>
           <w:p>
             <w:r>
-              <w:t>SCCM/Configuration Manager, AD/GPO und lokaler Betrieb. Intune noch nicht etabliert.</w:t>
+              <w:t>&lt;DEPLOYMENT-TOOL&gt;, &lt;VERZEICHNISDIENST&gt; und lokaler Betrieb. &lt;MDM-LÖSUNG&gt; noch nicht etabliert.</w:t>
             </w:r>
           </w:p>
         </w:tc>
@@ -1269,7 +1265,7 @@
           </w:tcPr>
           <w:p>
             <w:r>
-              <w:t>Q4-Abhängigkeit</w:t>
+              <w:t>&lt;PROJEKTABHÄNGIGKEIT&gt;</w:t>
             </w:r>
           </w:p>
         </w:tc>
@@ -1279,7 +1275,7 @@
           </w:tcPr>
           <w:p>
             <w:r>
-              <w:t>Intune-Konfiguration/Nutzung ist für Q4 geplant und muss mit Office-Rollout und Co-Management-Zielbild abgestimmt werden.</w:t>
+              <w:t>&lt;MDM-KONFIGURATION&gt; ist für &lt;MEILENSTEIN&gt; geplant und muss mit Office-Rollout und Co-Management-Zielbild abgestimmt werden.</w:t>
             </w:r>
           </w:p>
         </w:tc>
@@ -1491,7 +1487,7 @@
           </w:tcPr>
           <w:p>
             <w:r>
-              <w:t>SCCM-first Pilotfähigkeit sichern</w:t>
+              <w:t>&lt;DEPLOYMENT-FIRST&gt; Pilotfähigkeit sichern</w:t>
             </w:r>
           </w:p>
         </w:tc>
@@ -1501,7 +1497,7 @@
           </w:tcPr>
           <w:p>
             <w:r>
-              <w:t>Microsoft 365 Apps initial über SCCM/ODT/Configuration Manager bewerten; GPO-Kollisionen identifizieren.</w:t>
+              <w:t>&lt;PROJEKTTITEL&gt; initial über &lt;DEPLOYMENT-TOOL&gt; bewerten; GPO-Kollisionen identifizieren.</w:t>
             </w:r>
           </w:p>
         </w:tc>
@@ -1511,7 +1507,7 @@
           </w:tcPr>
           <w:p>
             <w:r>
-              <w:t>Pilotfähiges initiales Betriebsmodell ohne Intune-Voraussetzung.</w:t>
+              <w:t>Pilotfähiges initiales Betriebsmodell ohne &lt;MDM-LÖSUNG&gt;-Voraussetzung.</w:t>
             </w:r>
           </w:p>
         </w:tc>
@@ -1626,7 +1622,7 @@
           </w:tcPr>
           <w:p>
             <w:r>
-              <w:t>Q4 Intune-/Co-Management-Zielbild vorbereiten</w:t>
+              <w:t>&lt;MEILENSTEIN&gt; &lt;MDM-ZIELBILD&gt; vorbereiten</w:t>
             </w:r>
           </w:p>
         </w:tc>
@@ -1865,63 +1861,55 @@
               <w:rPr>
                 <w:lang w:val="en-US"/>
               </w:rPr>
-              <w:t>Intune/Co-Management, Kiosk-</w:t>
+              <w:t>&lt;MDM-LÖSUNG&gt;, Kiosk-Konfiguration, Shared Device Mode, Terminalserver-Konzept, Purview/Defender/Compliance getrennt planen.</w:t>
             </w:r>
             <w:proofErr w:type="spellStart"/>
             <w:r>
               <w:rPr>
                 <w:lang w:val="en-US"/>
               </w:rPr>
-              <w:t>Konfiguration</w:t>
             </w:r>
             <w:proofErr w:type="spellEnd"/>
             <w:r>
               <w:rPr>
                 <w:lang w:val="en-US"/>
               </w:rPr>
-              <w:t xml:space="preserve">, Shared Device Mode, </w:t>
             </w:r>
             <w:proofErr w:type="spellStart"/>
             <w:r>
               <w:rPr>
                 <w:lang w:val="en-US"/>
               </w:rPr>
-              <w:t>Terminalserver-Konzept</w:t>
             </w:r>
             <w:proofErr w:type="spellEnd"/>
             <w:r>
               <w:rPr>
                 <w:lang w:val="en-US"/>
               </w:rPr>
-              <w:t xml:space="preserve">, Purview/Defender/Compliance </w:t>
             </w:r>
             <w:proofErr w:type="spellStart"/>
             <w:r>
               <w:rPr>
                 <w:lang w:val="en-US"/>
               </w:rPr>
-              <w:t>getrennt</w:t>
             </w:r>
             <w:proofErr w:type="spellEnd"/>
             <w:r>
               <w:rPr>
                 <w:lang w:val="en-US"/>
               </w:rPr>
-              <w:t xml:space="preserve"> </w:t>
             </w:r>
             <w:proofErr w:type="spellStart"/>
             <w:r>
               <w:rPr>
                 <w:lang w:val="en-US"/>
               </w:rPr>
-              <w:t>planen</w:t>
             </w:r>
             <w:proofErr w:type="spellEnd"/>
             <w:r>
               <w:rPr>
                 <w:lang w:val="en-US"/>
               </w:rPr>
-              <w:t>.</w:t>
             </w:r>
           </w:p>
           <w:p>
@@ -2069,7 +2057,7 @@
           </w:tcPr>
           <w:p>
             <w:r>
-              <w:t>Client Management, Support und M365/Office-Verantwortliche testen Installation, Aktivierung, SCCM-Steuerung, Updates und Policies.</w:t>
+              <w:t>Client Management, Support und &lt;PROJEKTVERANTWORTLICHE&gt; testen Installation, Aktivierung, &lt;DEPLOYMENT-TOOL&gt;-Steuerung, Updates und Policies.</w:t>
             </w:r>
           </w:p>
         </w:tc>
@@ -2089,7 +2077,7 @@
           </w:tcPr>
           <w:p>
             <w:r>
-              <w:t>SCCM-Paket, Updatequelle, GPO-Konflikte</w:t>
+              <w:t>&lt;DEPLOYMENT-PAKET&gt;, Updatequelle, GPO-Konflikte</w:t>
             </w:r>
           </w:p>
         </w:tc>
@@ -2159,7 +2147,7 @@
           </w:tcPr>
           <w:p>
             <w:r>
-              <w:t>Controlling, PowerBI-/Reporting-nahe Nutzer, Excel-/Access-/Makro-Schwerpunkte.</w:t>
+              <w:t>Controlling, &lt;REPORTING&gt; Nutzer, Excel-/Access-/Makro-Schwerpunkte.</w:t>
             </w:r>
           </w:p>
         </w:tc>
@@ -2187,28 +2175,25 @@
               <w:rPr>
                 <w:lang w:val="en-US"/>
               </w:rPr>
-              <w:t xml:space="preserve">Corporate Planner, </w:t>
+              <w:t>&lt;FACHAPPLIKATION&gt;, &lt;BI-TOOL&gt;, Access, Makros</w:t>
             </w:r>
             <w:proofErr w:type="spellStart"/>
             <w:r>
               <w:rPr>
                 <w:lang w:val="en-US"/>
               </w:rPr>
-              <w:t>PowerBI</w:t>
             </w:r>
             <w:proofErr w:type="spellEnd"/>
             <w:r>
               <w:rPr>
                 <w:lang w:val="en-US"/>
               </w:rPr>
-              <w:t xml:space="preserve"> Desktop, Access, </w:t>
             </w:r>
             <w:proofErr w:type="spellStart"/>
             <w:r>
               <w:rPr>
                 <w:lang w:val="en-US"/>
               </w:rPr>
-              <w:t>Makros</w:t>
             </w:r>
             <w:proofErr w:type="spellEnd"/>
           </w:p>
@@ -2393,7 +2378,7 @@
           </w:tcPr>
           <w:p>
             <w:r>
-              <w:t>Office-LTSC-Bestand, Editionen, Architektur, Builds, SCCM-Pakete, Updatewege, GPOs, Geräteklassen, Nutzergruppen und Lizenzlage erfassen.</w:t>
+              <w:t>Office-LTSC-Bestand, Editionen, Architektur, Builds, &lt;DEPLOYMENT-PAKET&gt;e, Updatewege, GPOs, Geräteklassen, Nutzergruppen und Lizenzlage erfassen.</w:t>
             </w:r>
           </w:p>
         </w:tc>
@@ -2484,7 +2469,7 @@
           </w:tcPr>
           <w:p>
             <w:r>
-              <w:t>Monthly Enterprise, Current und Sonderfälle bewerten. SCCM/GPO/Updateprozess, Test, Freigabe und Kommunikation als Zielbild skizzieren.</w:t>
+              <w:t>Monthly Enterprise, Current und Sonderfälle bewerten. &lt;DEPLOYMENT-TOOL&gt;/GPO/Updateprozess, Test, Freigabe und Kommunikation als Zielbild skizzieren.</w:t>
             </w:r>
           </w:p>
         </w:tc>
@@ -2529,7 +2514,7 @@
           </w:tcPr>
           <w:p>
             <w:r>
-              <w:t>Pilotgruppen, Testmatrix, Kommunikation, Supportweg, Rollback-Erwartung, SCCM-/ODT-Ansatz und Lizenz-/Aktivierungsmodell vorbereiten.</w:t>
+              <w:t>Pilotgruppen, Testmatrix, Kommunikation, Supportweg, Rollback-Erwartung, &lt;DEPLOYMENT-TOOL&gt;-/ODT-Ansatz und Lizenz-/Aktivierungsmodell vorbereiten.</w:t>
             </w:r>
           </w:p>
         </w:tc>
@@ -2574,7 +2559,7 @@
           </w:tcPr>
           <w:p>
             <w:r>
-              <w:t>Microsoft 365 Apps auf definierten Geräten installieren, aktivieren, aktualisieren und mit Fachprozessen testen.</w:t>
+              <w:t>&lt;PROJEKTTITEL&gt; auf definierten Geräten installieren, aktivieren, aktualisieren und mit Fachprozessen testen.</w:t>
             </w:r>
           </w:p>
         </w:tc>
@@ -3006,7 +2991,7 @@
           </w:tcPr>
           <w:p>
             <w:r>
-              <w:t>Intune-/Co-Management-Zielbild Q4 kollidiert mit Office-Rolloutplanung</w:t>
+              <w:t>&lt;MDM-ZIELBILD&gt; &lt;MEILENSTEIN&gt; kollidiert mit Office-Rolloutplanung</w:t>
             </w:r>
           </w:p>
         </w:tc>
@@ -3026,7 +3011,7 @@
           </w:tcPr>
           <w:p>
             <w:r>
-              <w:t>SCCM-first und Q4-Intune-Workloads getrennt entscheiden; Authority Model dokumentieren.</w:t>
+              <w:t>&lt;DEPLOYMENT-FIRST&gt; und &lt;MEILENSTEIN&gt;-&lt;MDM-WORKLOADS&gt; getrennt entscheiden; Authority Model dokumentieren.</w:t>
             </w:r>
           </w:p>
         </w:tc>
@@ -3036,7 +3021,7 @@
           </w:tcPr>
           <w:p>
             <w:r>
-              <w:t>Welche Workloads sollen Q4 zu Intune/Co-Management wechseln?</w:t>
+              <w:t>Welche Workloads sollen &lt;MEILENSTEIN&gt; zu &lt;MDM-LÖSUNG&gt; wechseln?</w:t>
             </w:r>
           </w:p>
         </w:tc>
@@ -3421,7 +3406,7 @@
       </w:pPr>
       <w:bookmarkStart w:id="4" w:name="_Toc230298899"/>
       <w:r>
-        <w:t>Purview / Informationsschutz</w:t>
+        <w:t>&lt;RANDTHEMA 1&gt;</w:t>
       </w:r>
       <w:bookmarkEnd w:id="4"/>
     </w:p>
@@ -3455,7 +3440,7 @@
       </w:pPr>
       <w:bookmarkStart w:id="5" w:name="_Toc230298900"/>
       <w:r>
-        <w:t>Lizenzierung / Aktivierung</w:t>
+        <w:t>&lt;RANDTHEMA 2&gt;</w:t>
       </w:r>
       <w:bookmarkEnd w:id="5"/>
     </w:p>
@@ -3464,7 +3449,7 @@
         <w:pStyle w:val="BechtleAufzhlung"/>
       </w:pPr>
       <w:r>
-        <w:t>Zu prüfen: vorhandene Microsoft-365-Lizenzen, Microsoft 365 Apps for enterprise, E/F-Modelle, Shared Computer Activation, Terminalserver/VDI, Shared Devices sowie Project/Visio.</w:t>
+        <w:t>Zu prüfen: vorhandene Microsoft-365-Lizenzen, &lt;PROJEKTTITEL&gt;, E/F-Modelle, Shared Computer Activation, Terminalserver/VDI, Shared Devices sowie Project/Visio.</w:t>
       </w:r>
     </w:p>
     <w:p>
@@ -3489,7 +3474,7 @@
       </w:pPr>
       <w:bookmarkStart w:id="6" w:name="_Toc230298901"/>
       <w:r>
-        <w:t>Cloud-Speicher</w:t>
+        <w:t>&lt;RANDTHEMA 3&gt;</w:t>
       </w:r>
       <w:bookmarkEnd w:id="6"/>
     </w:p>
@@ -3498,7 +3483,7 @@
         <w:pStyle w:val="BechtleAufzhlung"/>
       </w:pPr>
       <w:r>
-        <w:t>Zu prüfen: Rolle von OneDrive, SharePoint und Teams-Dateien, erlaubte Datenklassen, Sync-/Offline-Anforderungen, Pfadlängen, Dateigrößen, Freigaben, Retention, Backup und Archivierung.</w:t>
+        <w:t>Zu prüfen: Rolle von &lt;CLOUDSPEICHER&gt;, &lt;KOLLABORATIONSPLATTFORM&gt; und &lt;KOLLABORATIONSPLATTFORM&gt;, erlaubte Datenklassen, Sync-/Offline-Anforderungen, Pfadlängen, Dateigrößen, Freigaben, Retention, Backup und Archivierung.</w:t>
       </w:r>
     </w:p>
     <w:p>
@@ -3506,7 +3491,7 @@
         <w:pStyle w:val="BechtleAufzhlung"/>
       </w:pPr>
       <w:r>
-        <w:t>Mögliche Folgestufe: Cloud-Speicher-/OneDrive-/SharePoint-Governance-Check oder Pilot mit ausgewählten Ablagen.</w:t>
+        <w:t>Mögliche Folgestufe: Cloud-Speicher-/&lt;CLOUDSPEICHER&gt;-/&lt;KOLLABORATIONSPLATTFORM&gt;-Governance-Check oder Pilot mit ausgewählten Ablagen.</w:t>
       </w:r>
     </w:p>
     <w:p>
@@ -3514,7 +3499,7 @@
         <w:pStyle w:val="BechtleAufzhlung"/>
       </w:pPr>
       <w:r>
-        <w:t>Abgrenzung: keine SharePoint-/OneDrive- oder Fileshare-Migration und keine Backup-/Archivstrategie im aktuellen Scope.</w:t>
+        <w:t>Abgrenzung: keine &lt;KOLLABORATIONSPLATTFORM&gt;-/&lt;CLOUDSPEICHER&gt;- oder Fileshare-Migration und keine Backup-/Archivstrategie im aktuellen Scope.</w:t>
       </w:r>
     </w:p>
     <w:p>
@@ -3523,7 +3508,7 @@
       </w:pPr>
       <w:bookmarkStart w:id="7" w:name="_Toc230298902"/>
       <w:r>
-        <w:t>Fileshares</w:t>
+        <w:t>&lt;RANDTHEMA 4&gt;</w:t>
       </w:r>
       <w:bookmarkEnd w:id="7"/>
     </w:p>
@@ -3557,8 +3542,7 @@
       </w:pPr>
       <w:bookmarkStart w:id="8" w:name="_Toc230298903"/>
       <w:r>
-        <w:lastRenderedPageBreak/>
-        <w:t>Randfälle / Sonderfälle</w:t>
+        <w:t>&lt;RANDTHEMA 5&gt;</w:t>
       </w:r>
       <w:bookmarkEnd w:id="8"/>
     </w:p>
@@ -3592,7 +3576,7 @@
       </w:pPr>
       <w:bookmarkStart w:id="9" w:name="_Toc230298904"/>
       <w:r>
-        <w:t>Integrationen</w:t>
+        <w:t>&lt;RANDTHEMA 6&gt;</w:t>
       </w:r>
       <w:bookmarkEnd w:id="9"/>
     </w:p>
@@ -3607,7 +3591,7 @@
         <w:rPr>
           <w:lang w:val="en-US"/>
         </w:rPr>
-        <w:t>Zu prüfen: DMS-/Archiv-, ERP-, Reporting-, Outlook-, Excel-, Word-, Access-, Teams-, COM/VSTO-, ODBC-/Datenbank-, EWS-, Graph-, SMTP/Exchange- und lokale Integrationspfade.</w:t>
+        <w:t>Zu prüfen: DMS-/Archiv-, ERP-, Reporting-, Outlook-, Excel-, Word-, Access-, &lt;KOLLABORATION-&gt;, COM/VSTO-, ODBC-/Datenbank-, EWS-, Graph-, SMTP/Exchange- und lokale Integrationspfade.</w:t>
       </w:r>
     </w:p>
     <w:p>
@@ -3874,75 +3858,64 @@
       <w:rPr>
         <w:sz w:val="16"/>
       </w:rPr>
-      <w:t xml:space="preserve">Bechtle | Workshop-Konzept und Management Sum | Seite </w:t>
+      <w:t>Bechtle | &lt;DOKUMENTTITEL&gt; | Seite X von Y</w:t>
     </w:r>
     <w:r>
       <w:rPr>
         <w:sz w:val="16"/>
       </w:rPr>
-      <w:fldChar w:fldCharType="begin"/>
     </w:r>
     <w:r>
       <w:rPr>
         <w:sz w:val="16"/>
       </w:rPr>
-      <w:instrText>PAGE</w:instrText>
     </w:r>
     <w:r>
       <w:rPr>
         <w:sz w:val="16"/>
       </w:rPr>
-      <w:fldChar w:fldCharType="separate"/>
     </w:r>
     <w:r>
       <w:rPr>
         <w:noProof/>
         <w:sz w:val="16"/>
       </w:rPr>
-      <w:t>5</w:t>
     </w:r>
     <w:r>
       <w:rPr>
         <w:sz w:val="16"/>
       </w:rPr>
-      <w:fldChar w:fldCharType="end"/>
     </w:r>
     <w:r>
       <w:rPr>
         <w:sz w:val="16"/>
       </w:rPr>
-      <w:t xml:space="preserve"> von </w:t>
     </w:r>
     <w:r>
       <w:rPr>
         <w:sz w:val="16"/>
       </w:rPr>
-      <w:fldChar w:fldCharType="begin"/>
     </w:r>
     <w:r>
       <w:rPr>
         <w:sz w:val="16"/>
       </w:rPr>
-      <w:instrText>NUMPAGES</w:instrText>
     </w:r>
     <w:r>
       <w:rPr>
         <w:sz w:val="16"/>
       </w:rPr>
-      <w:fldChar w:fldCharType="separate"/>
     </w:r>
     <w:r>
       <w:rPr>
         <w:noProof/>
         <w:sz w:val="16"/>
       </w:rPr>
-      <w:t>1</w:t>
     </w:r>
     <w:r>
       <w:rPr>
         <w:sz w:val="16"/>
       </w:rPr>
-      <w:fldChar w:fldCharType="end"/>
     </w:r>
   </w:p>
 </w:ftr>
@@ -4491,7 +4464,7 @@
         <w:color w:val="1F4E79"/>
         <w:sz w:val="16"/>
       </w:rPr>
-      <w:t xml:space="preserve">MDF AG | Office LTSC zu Microsoft 365 Apps </w:t>
+      <w:t xml:space="preserve">&lt;KUNDE&gt; | &lt;PROJEKTTITEL&gt; </w:t>
     </w:r>
   </w:p>
 </w:hdr>

</xml_diff>